<commit_message>
docs: new deps and updated template
</commit_message>
<xml_diff>
--- a/plantillas/template_diagnostico_IDIEM.docx
+++ b/plantillas/template_diagnostico_IDIEM.docx
@@ -194,7 +194,7 @@
               <w:rPr>
                 <w:color w:val="auto"/>
               </w:rPr>
-              <w:t>DIAGNÓSTICO DEL ESTADO DE CONSERVACIÓN MONUMENTO HISTÓRICO HOSPITAL EL SALVADOR - PROVIDENCIA</w:t>
+              <w:t>{{TITULO}}</w:t>
             </w:r>
           </w:p>
         </w:tc>
@@ -258,7 +258,7 @@
                 <w:szCs w:val="20"/>
                 <w:lang w:val="es-CL"/>
               </w:rPr>
-              <w:t>PR.DEP.2025.0215</w:t>
+              <w:t>{{PR_CODE}}</w:t>
             </w:r>
           </w:p>
         </w:tc>
@@ -312,7 +312,17 @@
                 <w:sz w:val="20"/>
                 <w:szCs w:val="20"/>
               </w:rPr>
-              <w:t>Revisión Nº2</w:t>
+              <w:t>Revisión</w:t>
+            </w:r>
+            <w:r>
+              <w:rPr>
+                <w:rFonts w:ascii="Open Sans" w:hAnsi="Open Sans" w:cs="Open Sans"/>
+                <w:bCs w:val="0"/>
+                <w:color w:val="auto"/>
+                <w:sz w:val="20"/>
+                <w:szCs w:val="20"/>
+              </w:rPr>
+              <w:t xml:space="preserve"> {{REVISION}}</w:t>
             </w:r>
           </w:p>
         </w:tc>
@@ -400,7 +410,7 @@
               </wp:anchor>
             </w:drawing>
           </mc:Choice>
-          <mc:Fallback xmlns:w16sdtfl="http://schemas.microsoft.com/office/word/2024/wordml/sdtformatlock" xmlns:w16du="http://schemas.microsoft.com/office/word/2023/wordml/word16du" xmlns:oel="http://schemas.microsoft.com/office/2019/extlst">
+          <mc:Fallback xmlns:oel="http://schemas.microsoft.com/office/2019/extlst" xmlns:w16du="http://schemas.microsoft.com/office/word/2023/wordml/word16du" xmlns:w16sdtfl="http://schemas.microsoft.com/office/word/2024/wordml/sdtformatlock">
             <w:pict>
               <v:rect w14:anchorId="7285EAB1" id="Rectángulo 43" o:spid="_x0000_s1026" style="position:absolute;margin-left:0;margin-top:23.15pt;width:4pt;height:133.25pt;z-index:251663360;visibility:visible;mso-wrap-style:square;mso-height-percent:0;mso-wrap-distance-left:9pt;mso-wrap-distance-top:0;mso-wrap-distance-right:9pt;mso-wrap-distance-bottom:0;mso-position-horizontal:absolute;mso-position-horizontal-relative:text;mso-position-vertical:absolute;mso-position-vertical-relative:text;mso-height-percent:0;mso-height-relative:margin;v-text-anchor:middle" o:gfxdata="UEsDBBQABgAIAAAAIQC2gziS/gAAAOEBAAATAAAAW0NvbnRlbnRfVHlwZXNdLnhtbJSRQU7DMBBF 90jcwfIWJU67QAgl6YK0S0CoHGBkTxKLZGx5TGhvj5O2G0SRWNoz/78nu9wcxkFMGNg6quQqL6RA 0s5Y6ir5vt9lD1JwBDIwOMJKHpHlpr69KfdHjyxSmriSfYz+USnWPY7AufNIadK6MEJMx9ApD/oD OlTrorhX2lFEilmcO2RdNtjC5xDF9pCuTyYBB5bi6bQ4syoJ3g9WQ0ymaiLzg5KdCXlKLjvcW893 SUOqXwnz5DrgnHtJTxOsQfEKIT7DmDSUCaxw7Rqn8787ZsmRM9e2VmPeBN4uqYvTtW7jvijg9N/y JsXecLq0q+WD6m8AAAD//wMAUEsDBBQABgAIAAAAIQA4/SH/1gAAAJQBAAALAAAAX3JlbHMvLnJl bHOkkMFqwzAMhu+DvYPRfXGawxijTi+j0GvpHsDYimMaW0Yy2fr2M4PBMnrbUb/Q94l/f/hMi1qR JVI2sOt6UJgd+ZiDgffL8ekFlFSbvV0oo4EbChzGx4f9GRdb25HMsYhqlCwG5lrLq9biZkxWOiqY 22YiTra2kYMu1l1tQD30/bPm3wwYN0x18gb45AdQl1tp5j/sFB2T0FQ7R0nTNEV3j6o9feQzro1i OWA14Fm+Q8a1a8+Bvu/d/dMb2JY5uiPbhG/ktn4cqGU/er3pcvwCAAD//wMAUEsDBBQABgAIAAAA IQDvurrSZQIAAEkFAAAOAAAAZHJzL2Uyb0RvYy54bWysVF9P2zAQf5+072D5faTpgEFFiioY0yQE CJh4dh27teT4vLPbtPv0Oztp2jEkpGkv9p3vd//vfHG5aSxbKwwGXMXLoxFnykmojVtU/Mfzzacz zkIUrhYWnKr4VgV+Of344aL1EzWGJdhaISMjLkxaX/FljH5SFEEuVSPCEXjlSKgBGxGJxUVRo2jJ emOL8Wh0WrSAtUeQKgR6ve6EfJrta61kvNc6qMhsxSm2mE/M5zydxfRCTBYo/NLIPgzxD1E0wjhy Opi6FlGwFZq/TDVGIgTQ8UhCU4DWRqqcA2VTjl5l87QUXuVcqDjBD2UK/8+svFs/+QekMrQ+TAKR KYuNxibdFB/b5GJth2KpTWSSHk9GZyOqqCRJeXpOvcjFLPbKHkP8pqBhiag4Ui9yicT6NkRySNAd JPkKYE19Y6zNDC7mVxbZWlDfvibjO+t/wKxLYAdJrbPYvajc+d7NPrFMxa1VScu6R6WZqSmVMseV Z04NXoWUysUyTQhFmtFJTZOrQfHz+4o9Pql2UQ3K4/eVB43sGVwclBvjAN8yYIeQdYen8A/yTuQc 6u0DMoRuG4KXN4ZadCtCfBBI409tpZWO93RoC23Foac4WwL+eus94WkqScpZS+tU8fBzJVBxZr87 mtfz8vg47V9mjk++jInBQ8n8UOJWzRVQ50v6PLzMZMJHuyM1QvNCmz9LXkkknCTfFZcRd8xV7Nac /g6pZrMMo53zIt66Jy93XU8j+Lx5Eej7OY004HewWz0xeTWuHTb1w8FsFUGbPMv7uvb1pn3Ng9P/ LelDOOQzav8DTn8DAAD//wMAUEsDBBQABgAIAAAAIQASTaME2wAAAAUBAAAPAAAAZHJzL2Rvd25y ZXYueG1sTI9BS8NAFITvgv9heYI3u0krNca8FKlYvFSwlZ632WcSzL4N2W2T/nufJz0OM8x8U6wm 16kzDaH1jJDOElDElbct1wif+9e7DFSIhq3pPBPChQKsyuurwuTWj/xB512slZRwyA1CE2Ofax2q hpwJM98Ti/flB2eiyKHWdjCjlLtOz5NkqZ1pWRYa09O6oep7d3IID609bN3jZkz9/rLlzdvl8PK+ Rry9mZ6fQEWa4l8YfvEFHUphOvoT26A6BDkSEe6XC1DiZiKPCIt0noEuC/2fvvwBAAD//wMAUEsB Ai0AFAAGAAgAAAAhALaDOJL+AAAA4QEAABMAAAAAAAAAAAAAAAAAAAAAAFtDb250ZW50X1R5cGVz XS54bWxQSwECLQAUAAYACAAAACEAOP0h/9YAAACUAQAACwAAAAAAAAAAAAAAAAAvAQAAX3JlbHMv LnJlbHNQSwECLQAUAAYACAAAACEA77q60mUCAABJBQAADgAAAAAAAAAAAAAAAAAuAgAAZHJzL2Uy b0RvYy54bWxQSwECLQAUAAYACAAAACEAEk2jBNsAAAAFAQAADwAAAAAAAAAAAAAAAAC/BAAAZHJz L2Rvd25yZXYueG1sUEsFBgAAAAAEAAQA8wAAAMcFAAAAAA== " fillcolor="#e20000" stroked="f"/>
             </w:pict>
@@ -668,6 +678,7 @@
                 <w:lang w:val="es-CL"/>
               </w:rPr>
             </w:pPr>
+            <w:proofErr w:type="spellStart"/>
             <w:r>
               <w:rPr>
                 <w:rFonts w:ascii="Open Sans" w:hAnsi="Open Sans" w:cs="Open Sans"/>
@@ -675,7 +686,26 @@
                 <w:color w:val="auto"/>
                 <w:lang w:val="es-CL"/>
               </w:rPr>
-              <w:t>Nº de páginas: 11</w:t>
+              <w:t>Nº</w:t>
+            </w:r>
+            <w:proofErr w:type="spellEnd"/>
+            <w:r>
+              <w:rPr>
+                <w:rFonts w:ascii="Open Sans" w:hAnsi="Open Sans" w:cs="Open Sans"/>
+                <w:noProof w:val="0"/>
+                <w:color w:val="auto"/>
+                <w:lang w:val="es-CL"/>
+              </w:rPr>
+              <w:t xml:space="preserve"> de páginas:</w:t>
+            </w:r>
+            <w:r>
+              <w:rPr>
+                <w:rFonts w:ascii="Open Sans" w:hAnsi="Open Sans" w:cs="Open Sans"/>
+                <w:noProof w:val="0"/>
+                <w:color w:val="auto"/>
+                <w:lang w:val="es-CL"/>
+              </w:rPr>
+              <w:t xml:space="preserve"> {{N_PAGINAS}}</w:t>
             </w:r>
           </w:p>
         </w:tc>
@@ -701,7 +731,27 @@
                 <w:color w:val="auto"/>
                 <w:lang w:val="es-CL"/>
               </w:rPr>
-              <w:t>Revisión Nº2</w:t>
+              <w:t xml:space="preserve">Revisión </w:t>
+            </w:r>
+            <w:proofErr w:type="spellStart"/>
+            <w:r>
+              <w:rPr>
+                <w:rFonts w:ascii="Open Sans" w:hAnsi="Open Sans" w:cs="Open Sans"/>
+                <w:noProof w:val="0"/>
+                <w:color w:val="auto"/>
+                <w:lang w:val="es-CL"/>
+              </w:rPr>
+              <w:t>N°</w:t>
+            </w:r>
+            <w:proofErr w:type="spellEnd"/>
+            <w:r>
+              <w:rPr>
+                <w:rFonts w:ascii="Open Sans" w:hAnsi="Open Sans" w:cs="Open Sans"/>
+                <w:noProof w:val="0"/>
+                <w:color w:val="auto"/>
+                <w:lang w:val="es-CL"/>
+              </w:rPr>
+              <w:t>{{REVISION}}</w:t>
             </w:r>
           </w:p>
         </w:tc>
@@ -784,6 +834,7 @@
           <w:rFonts w:ascii="Open Sans" w:eastAsia="Times New Roman" w:hAnsi="Open Sans" w:cs="Open Sans"/>
           <w:sz w:val="20"/>
           <w:szCs w:val="20"/>
+          <w:u w:val="single"/>
         </w:rPr>
       </w:pPr>
     </w:p>
@@ -910,7 +961,17 @@
                 <w:color w:val="auto"/>
                 <w:lang w:val="es-CL"/>
               </w:rPr>
-              <w:t xml:space="preserve"> 10-10-2025</w:t>
+              <w:t xml:space="preserve"> </w:t>
+            </w:r>
+            <w:r>
+              <w:rPr>
+                <w:rFonts w:ascii="Open Sans" w:hAnsi="Open Sans" w:cs="Open Sans"/>
+                <w:bCs/>
+                <w:noProof w:val="0"/>
+                <w:color w:val="auto"/>
+                <w:lang w:val="es-CL"/>
+              </w:rPr>
+              <w:t>{{FECHA}}</w:t>
             </w:r>
           </w:p>
         </w:tc>
@@ -972,28 +1033,7 @@
                 <w:color w:val="auto"/>
                 <w:lang w:val="es-CL"/>
               </w:rPr>
-              <w:t>Pilar Castellón F.</w:t>
-            </w:r>
-          </w:p>
-          <w:p>
-            <w:pPr>
-              <w:pStyle w:val="cuerpo1espacio"/>
-              <w:jc w:val="both"/>
-              <w:rPr>
-                <w:rFonts w:ascii="Open Sans" w:hAnsi="Open Sans" w:cs="Open Sans"/>
-                <w:noProof w:val="0"/>
-                <w:color w:val="auto"/>
-                <w:lang w:val="es-CL"/>
-              </w:rPr>
-            </w:pPr>
-            <w:r>
-              <w:rPr>
-                <w:rFonts w:ascii="Open Sans" w:hAnsi="Open Sans" w:cs="Open Sans"/>
-                <w:noProof w:val="0"/>
-                <w:color w:val="auto"/>
-                <w:lang w:val="es-CL"/>
-              </w:rPr>
-              <w:t>Pablo Herrera T.</w:t>
+              <w:t>{{ELABORADO}}</w:t>
             </w:r>
           </w:p>
         </w:tc>
@@ -1073,7 +1113,7 @@
                 <w:color w:val="auto"/>
                 <w:lang w:val="es-CL"/>
               </w:rPr>
-              <w:t>Guillermo Sierra R.</w:t>
+              <w:t>{{REVISADO}}</w:t>
             </w:r>
           </w:p>
         </w:tc>
@@ -1237,31 +1277,7 @@
                 <w:color w:val="auto"/>
                 <w:lang w:val="es-CL"/>
               </w:rPr>
-              <w:t>Servicio de Salud Metropolitano</w:t>
-            </w:r>
-          </w:p>
-          <w:p>
-            <w:pPr>
-              <w:pStyle w:val="cuerpo1espacio"/>
-              <w:jc w:val="both"/>
-              <w:rPr>
-                <w:rFonts w:ascii="Open Sans" w:hAnsi="Open Sans" w:cs="Open Sans"/>
-                <w:b/>
-                <w:bCs/>
-                <w:noProof w:val="0"/>
-                <w:color w:val="auto"/>
-                <w:sz w:val="20"/>
-                <w:lang w:val="es-CL"/>
-              </w:rPr>
-            </w:pPr>
-            <w:r>
-              <w:rPr>
-                <w:rFonts w:ascii="Open Sans" w:hAnsi="Open Sans" w:cs="Open Sans"/>
-                <w:noProof w:val="0"/>
-                <w:color w:val="auto"/>
-                <w:lang w:val="es-CL"/>
-              </w:rPr>
-              <w:t>Oriente</w:t>
+              <w:t>{{CLIENTE}}</w:t>
             </w:r>
           </w:p>
         </w:tc>
@@ -2367,15 +2383,7 @@
           <w:color w:val="FF0000"/>
           <w:lang w:val="es-CL"/>
         </w:rPr>
-        <w:t xml:space="preserve">▶ PEGAR AQUÍ: </w:t>
-      </w:r>
-      <w:r>
-        <w:rPr>
-          <w:rFonts w:ascii="Open Sans" w:hAnsi="Open Sans" w:cs="Open Sans"/>
-          <w:color w:val="FF0000"/>
-          <w:lang w:val="es-CL"/>
-        </w:rPr>
-        <w:t>SECCIÓN 1 — ALCANCE (texto generado por el generador HTML)</w:t>
+        <w:t>▶ PEGAR AQUÍ: SECCIÓN 1 — ALCANCE (texto generado por el generador HTML)</w:t>
       </w:r>
     </w:p>
     <w:p>
@@ -2595,15 +2603,7 @@
           <w:color w:val="FF0000"/>
           <w:lang w:val="es-CL"/>
         </w:rPr>
-        <w:t xml:space="preserve">▶ PEGAR </w:t>
-      </w:r>
-      <w:r>
-        <w:rPr>
-          <w:rFonts w:ascii="Open Sans" w:hAnsi="Open Sans" w:cs="Open Sans"/>
-          <w:color w:val="FF0000"/>
-          <w:lang w:val="es-CL"/>
-        </w:rPr>
-        <w:t>AQUÍ: SECCIÓN 6 — EXCLUSIONES (texto generado por el generador HTML)</w:t>
+        <w:t>▶ PEGAR AQUÍ: SECCIÓN 6 — EXCLUSIONES (texto generado por el generador HTML)</w:t>
       </w:r>
     </w:p>
     <w:p>
@@ -4388,7 +4388,7 @@
             </wp:anchor>
           </w:drawing>
         </mc:Choice>
-        <mc:Fallback xmlns:w16sdtfl="http://schemas.microsoft.com/office/word/2024/wordml/sdtformatlock" xmlns:w16du="http://schemas.microsoft.com/office/word/2023/wordml/word16du" xmlns:oel="http://schemas.microsoft.com/office/2019/extlst">
+        <mc:Fallback xmlns:oel="http://schemas.microsoft.com/office/2019/extlst" xmlns:w16du="http://schemas.microsoft.com/office/word/2023/wordml/word16du" xmlns:w16sdtfl="http://schemas.microsoft.com/office/word/2024/wordml/sdtformatlock">
           <w:pict>
             <v:line w14:anchorId="37D28B5D" id="Conector recto 16" o:spid="_x0000_s1026" style="position:absolute;z-index:251643392;visibility:visible;mso-wrap-style:square;mso-width-percent:0;mso-height-percent:0;mso-wrap-distance-left:9pt;mso-wrap-distance-top:0;mso-wrap-distance-right:9pt;mso-wrap-distance-bottom:0;mso-position-horizontal:absolute;mso-position-horizontal-relative:text;mso-position-vertical:absolute;mso-position-vertical-relative:text;mso-width-percent:0;mso-height-percent:0;mso-width-relative:margin;mso-height-relative:margin" from=".15pt,1.65pt" to="513.75pt,1.65pt" o:gfxdata="UEsDBBQABgAIAAAAIQC2gziS/gAAAOEBAAATAAAAW0NvbnRlbnRfVHlwZXNdLnhtbJSRQU7DMBBF 90jcwfIWJU67QAgl6YK0S0CoHGBkTxKLZGx5TGhvj5O2G0SRWNoz/78nu9wcxkFMGNg6quQqL6RA 0s5Y6ir5vt9lD1JwBDIwOMJKHpHlpr69KfdHjyxSmriSfYz+USnWPY7AufNIadK6MEJMx9ApD/oD OlTrorhX2lFEilmcO2RdNtjC5xDF9pCuTyYBB5bi6bQ4syoJ3g9WQ0ymaiLzg5KdCXlKLjvcW893 SUOqXwnz5DrgnHtJTxOsQfEKIT7DmDSUCaxw7Rqn8787ZsmRM9e2VmPeBN4uqYvTtW7jvijg9N/y JsXecLq0q+WD6m8AAAD//wMAUEsDBBQABgAIAAAAIQA4/SH/1gAAAJQBAAALAAAAX3JlbHMvLnJl bHOkkMFqwzAMhu+DvYPRfXGawxijTi+j0GvpHsDYimMaW0Yy2fr2M4PBMnrbUb/Q94l/f/hMi1qR JVI2sOt6UJgd+ZiDgffL8ekFlFSbvV0oo4EbChzGx4f9GRdb25HMsYhqlCwG5lrLq9biZkxWOiqY 22YiTra2kYMu1l1tQD30/bPm3wwYN0x18gb45AdQl1tp5j/sFB2T0FQ7R0nTNEV3j6o9feQzro1i OWA14Fm+Q8a1a8+Bvu/d/dMb2JY5uiPbhG/ktn4cqGU/er3pcvwCAAD//wMAUEsDBBQABgAIAAAA IQBKzRAW2gEAABsEAAAOAAAAZHJzL2Uyb0RvYy54bWysU8lu2zAQvRfoPxC8x5IFxG0EyzkkSC9d gi4fQFNDiQA3kIwl/32HlCy5C1CgyIUihzNvGQ3396NW5AQ+SGsaut2UlIDhtpWma+iP70837ykJ kZmWKWugoWcI9P7w9s1+cDVUtreqBU8QxIR6cA3tY3R1UQTeg2ZhYx0YvBTWaxbx6Lui9WxAdK2K qix3xWB967zlEAJGH6dLesj4QgCPX4QIEIlqKGqLefV5Paa1OOxZ3XnmeslnGew/VGgmDZIuUI8s MvLi5R9QWnJvgxVxw60urBCSQ/aAbrblb26+9cxB9oLNCW5pU3g9WP759GCePbZhcKEO7tknF6Pw On1RHxlzs85Ls2CMhGNwd1tVd3cVJfxyV6yFzof4AawmadNQJU3ywWp2+hgikmHqJSWFlSEDTk/1 rsR/xLVrGxpMlyuCVbJ9kkqlvDwW8KA8OTH8ocdum3PUi/5k2ym2uy0RZKJY0jPhFRLSK5MAIY/I rGntQN7Fs4JJ3FcQRLbouZokpeFcVTDOwcTtzKkMZqcygZqXwvLfhXP+qmopnkwuZiafv7JOPi7M 1sSlWEtj/d/Y43iRLKZ8bNKV77Q92vacZyNf4ATmPs6vJY349TmXr2/68BMAAP//AwBQSwMEFAAG AAgAAAAhAFlz/6bYAAAABQEAAA8AAABkcnMvZG93bnJldi54bWxMjr1uwzAMhPcCfQeBBbo1clPk z7UcFAUydqiTIaNsMbYRizQsxXHfvkyXZiFB3uHuy7aT79SIQ2iZDLzOElBIFbuWagOH/e5lDSpE S852TGjgBwNs88eHzKaOr/SNYxFrJSEUUmugibFPtQ5Vg96GGfdIop148DbKOdTaDfYq4b7T8yRZ am9bkobG9vjZYHUuLt5AiefjYu/cir/WtNmNp6LnsTDm+Wn6eAcVcYr/ZrjhCzrkwlTyhVxQnYE3 8cmUdROT+WoBqvx76DzT9/T5LwAAAP//AwBQSwECLQAUAAYACAAAACEAtoM4kv4AAADhAQAAEwAA AAAAAAAAAAAAAAAAAAAAW0NvbnRlbnRfVHlwZXNdLnhtbFBLAQItABQABgAIAAAAIQA4/SH/1gAA AJQBAAALAAAAAAAAAAAAAAAAAC8BAABfcmVscy8ucmVsc1BLAQItABQABgAIAAAAIQBKzRAW2gEA ABsEAAAOAAAAAAAAAAAAAAAAAC4CAABkcnMvZTJvRG9jLnhtbFBLAQItABQABgAIAAAAIQBZc/+m 2AAAAAUBAAAPAAAAAAAAAAAAAAAAADQEAABkcnMvZG93bnJldi54bWxQSwUGAAAAAAQABADzAAAA OQUAAAAA " strokecolor="#a5a5a5 [2092]" strokeweight="1pt"/>
           </w:pict>
@@ -4465,7 +4465,7 @@
             </wp:anchor>
           </w:drawing>
         </mc:Choice>
-        <mc:Fallback xmlns:w16sdtfl="http://schemas.microsoft.com/office/word/2024/wordml/sdtformatlock" xmlns:w16du="http://schemas.microsoft.com/office/word/2023/wordml/word16du" xmlns:oel="http://schemas.microsoft.com/office/2019/extlst">
+        <mc:Fallback xmlns:oel="http://schemas.microsoft.com/office/2019/extlst" xmlns:w16du="http://schemas.microsoft.com/office/word/2023/wordml/word16du" xmlns:w16sdtfl="http://schemas.microsoft.com/office/word/2024/wordml/sdtformatlock">
           <w:pict>
             <v:rect w14:anchorId="4AF5C099" id="Rectángulo 42" o:spid="_x0000_s1026" style="position:absolute;margin-left:506.55pt;margin-top:8.1pt;width:7.05pt;height:35pt;z-index:251675136;visibility:visible;mso-wrap-style:square;mso-width-percent:0;mso-wrap-distance-left:9pt;mso-wrap-distance-top:0;mso-wrap-distance-right:9pt;mso-wrap-distance-bottom:0;mso-position-horizontal:absolute;mso-position-horizontal-relative:text;mso-position-vertical:absolute;mso-position-vertical-relative:text;mso-width-percent:0;mso-width-relative:margin;v-text-anchor:middle" o:gfxdata="UEsDBBQABgAIAAAAIQC2gziS/gAAAOEBAAATAAAAW0NvbnRlbnRfVHlwZXNdLnhtbJSRQU7DMBBF 90jcwfIWJU67QAgl6YK0S0CoHGBkTxKLZGx5TGhvj5O2G0SRWNoz/78nu9wcxkFMGNg6quQqL6RA 0s5Y6ir5vt9lD1JwBDIwOMJKHpHlpr69KfdHjyxSmriSfYz+USnWPY7AufNIadK6MEJMx9ApD/oD OlTrorhX2lFEilmcO2RdNtjC5xDF9pCuTyYBB5bi6bQ4syoJ3g9WQ0ymaiLzg5KdCXlKLjvcW893 SUOqXwnz5DrgnHtJTxOsQfEKIT7DmDSUCaxw7Rqn8787ZsmRM9e2VmPeBN4uqYvTtW7jvijg9N/y JsXecLq0q+WD6m8AAAD//wMAUEsDBBQABgAIAAAAIQA4/SH/1gAAAJQBAAALAAAAX3JlbHMvLnJl bHOkkMFqwzAMhu+DvYPRfXGawxijTi+j0GvpHsDYimMaW0Yy2fr2M4PBMnrbUb/Q94l/f/hMi1qR JVI2sOt6UJgd+ZiDgffL8ekFlFSbvV0oo4EbChzGx4f9GRdb25HMsYhqlCwG5lrLq9biZkxWOiqY 22YiTra2kYMu1l1tQD30/bPm3wwYN0x18gb45AdQl1tp5j/sFB2T0FQ7R0nTNEV3j6o9feQzro1i OWA14Fm+Q8a1a8+Bvu/d/dMb2JY5uiPbhG/ktn4cqGU/er3pcvwCAAD//wMAUEsDBBQABgAIAAAA IQCmicRQZgIAAEgFAAAOAAAAZHJzL2Uyb0RvYy54bWysVF9PGzEMf5+07xDlfVxb2g0qrqiCMU1C gICJ5zSXtJFyceakvXaffk7ueu0YEtK0l8SOf/5v5+JyW1u2URgMuJIPTwacKSehMm5Z8h/PN5/O OAtRuEpYcKrkOxX45ezjh4vGT9UIVmArhYyMuDBtfMlXMfppUQS5UrUIJ+CVI6EGrEUkFpdFhaIh 67UtRoPB56IBrDyCVCHQ63Ur5LNsX2sl473WQUVmS06xxXxiPhfpLGYXYrpE4VdGdmGIf4iiFsaR 097UtYiCrdH8Zao2EiGAjicS6gK0NlLlHCib4eBVNk8r4VXOhYoTfF+m8P/MyrvNk39AKkPjwzQQ mbLYaqzTTfGxbS7Wri+W2kYm6fHsfHI64UySZDweTwa5lsVB12OI3xTULBElR2pFrpDY3IZI/gi6 hyRXAaypboy1mcHl4soi2whq21fqc2/9D5h1CewgqbUW2xeVG9+5OeSVqbizKmlZ96g0MxVlMsxx 5ZFTvVchpXJxmAaEIs3opKbJVa94+r5ih0+qbVS98uh95V4jewYXe+XaOMC3DNg+ZN3iKfyjvBO5 gGr3gAyhXYbg5Y2hFt2KEB8E0vTTntBGx3s6tIWm5NBRnK0Af731nvA0lCTlrKFtKnn4uRaoOLPf HY3r+XA8TuuXmfHky4gYPJYsjiVuXV8BdX5If4eXmUz4aPekRqhfaPHnySuJhJPku+Qy4p65iu2W 09ch1XyeYbRyXsRb9+TlvutpBJ+3LwJ9N6eR5vsO9psnpq/GtcWmfjiYryNok2f5UNeu3rSueXC6 ryX9B8d8Rh0+wNlvAAAA//8DAFBLAwQUAAYACAAAACEA9Bq3vt4AAAALAQAADwAAAGRycy9kb3du cmV2LnhtbEyPQU/DMAyF70j8h8hI3FjSIm2jazqhISYuQ2JDO2eN11Y0TtVka/vv8U5we89+ev6c r0fXiiv2ofGkIZkpEEiltw1VGr4P709LECEasqb1hBomDLAu7u9yk1k/0Bde97ESXEIhMxrqGLtM ylDW6EyY+Q6Jd2ffOxPZ9pW0vRm43LUyVWounWmIL9Smw02N5c/+4jQsGnvcuZftkPjDtKPtx3R8 +9xo/fgwvq5ARBzjXxhu+IwOBTOd/IVsEC17lTwnnGU1T0HcEipdsDppWPJEFrn8/0PxCwAA//8D AFBLAQItABQABgAIAAAAIQC2gziS/gAAAOEBAAATAAAAAAAAAAAAAAAAAAAAAABbQ29udGVudF9U eXBlc10ueG1sUEsBAi0AFAAGAAgAAAAhADj9If/WAAAAlAEAAAsAAAAAAAAAAAAAAAAALwEAAF9y ZWxzLy5yZWxzUEsBAi0AFAAGAAgAAAAhAKaJxFBmAgAASAUAAA4AAAAAAAAAAAAAAAAALgIAAGRy cy9lMm9Eb2MueG1sUEsBAi0AFAAGAAgAAAAhAPQat77eAAAACwEAAA8AAAAAAAAAAAAAAAAAwAQA AGRycy9kb3ducmV2LnhtbFBLBQYAAAAABAAEAPMAAADLBQAAAAA= " fillcolor="#e20000" stroked="f"/>
           </w:pict>
@@ -4512,7 +4512,7 @@
                       <a:effectLst/>
                       <a:extLst>
                         <a:ext uri="{C572A759-6A51-4108-AA02-DFA0A04FC94B}">
-                          <ma14:wrappingTextBoxFlag xmlns:arto="http://schemas.microsoft.com/office/word/2006/arto" xmlns:ma14="http://schemas.microsoft.com/office/mac/drawingml/2011/main" xmlns:w="http://schemas.openxmlformats.org/wordprocessingml/2006/main" xmlns:w10="urn:schemas-microsoft-com:office:word" xmlns:v="urn:schemas-microsoft-com:vml" xmlns:o="urn:schemas-microsoft-com:office:office" xmlns:mv="urn:schemas-microsoft-com:mac:vml" xmlns:mo="http://schemas.microsoft.com/office/mac/office/2008/main" xmlns="" xmlns:w16sdtfl="http://schemas.microsoft.com/office/word/2024/wordml/sdtformatlock" xmlns:w16du="http://schemas.microsoft.com/office/word/2023/wordml/word16du" xmlns:oel="http://schemas.microsoft.com/office/2019/extlst"/>
+                          <ma14:wrappingTextBoxFlag xmlns:oel="http://schemas.microsoft.com/office/2019/extlst" xmlns:w16du="http://schemas.microsoft.com/office/word/2023/wordml/word16du" xmlns:w16sdtfl="http://schemas.microsoft.com/office/word/2024/wordml/sdtformatlock" xmlns="" xmlns:mo="http://schemas.microsoft.com/office/mac/office/2008/main" xmlns:mv="urn:schemas-microsoft-com:mac:vml" xmlns:o="urn:schemas-microsoft-com:office:office" xmlns:v="urn:schemas-microsoft-com:vml" xmlns:w10="urn:schemas-microsoft-com:office:word" xmlns:w="http://schemas.openxmlformats.org/wordprocessingml/2006/main" xmlns:ma14="http://schemas.microsoft.com/office/mac/drawingml/2011/main" xmlns:arto="http://schemas.microsoft.com/office/word/2006/arto"/>
                         </a:ext>
                       </a:extLst>
                     </wps:spPr>
@@ -4592,7 +4592,7 @@
             </wp:anchor>
           </w:drawing>
         </mc:Choice>
-        <mc:Fallback xmlns:w16sdtfl="http://schemas.microsoft.com/office/word/2024/wordml/sdtformatlock" xmlns:w16du="http://schemas.microsoft.com/office/word/2023/wordml/word16du" xmlns:oel="http://schemas.microsoft.com/office/2019/extlst">
+        <mc:Fallback xmlns:oel="http://schemas.microsoft.com/office/2019/extlst" xmlns:w16du="http://schemas.microsoft.com/office/word/2023/wordml/word16du" xmlns:w16sdtfl="http://schemas.microsoft.com/office/word/2024/wordml/sdtformatlock">
           <w:pict>
             <v:shapetype w14:anchorId="5968EC61" id="_x0000_t202" coordsize="21600,21600" o:spt="202" path="m,l,21600r21600,l21600,xe">
               <v:stroke joinstyle="miter"/>
@@ -4688,7 +4688,7 @@
                       <a:effectLst/>
                       <a:extLst>
                         <a:ext uri="{C572A759-6A51-4108-AA02-DFA0A04FC94B}">
-                          <ma14:wrappingTextBoxFlag xmlns:arto="http://schemas.microsoft.com/office/word/2006/arto" xmlns:ma14="http://schemas.microsoft.com/office/mac/drawingml/2011/main" xmlns:w="http://schemas.openxmlformats.org/wordprocessingml/2006/main" xmlns:w10="urn:schemas-microsoft-com:office:word" xmlns:v="urn:schemas-microsoft-com:vml" xmlns:o="urn:schemas-microsoft-com:office:office" xmlns:mv="urn:schemas-microsoft-com:mac:vml" xmlns:mo="http://schemas.microsoft.com/office/mac/office/2008/main" xmlns="" xmlns:w16sdtfl="http://schemas.microsoft.com/office/word/2024/wordml/sdtformatlock" xmlns:w16du="http://schemas.microsoft.com/office/word/2023/wordml/word16du" xmlns:oel="http://schemas.microsoft.com/office/2019/extlst"/>
+                          <ma14:wrappingTextBoxFlag xmlns:oel="http://schemas.microsoft.com/office/2019/extlst" xmlns:w16du="http://schemas.microsoft.com/office/word/2023/wordml/word16du" xmlns:w16sdtfl="http://schemas.microsoft.com/office/word/2024/wordml/sdtformatlock" xmlns="" xmlns:mo="http://schemas.microsoft.com/office/mac/office/2008/main" xmlns:mv="urn:schemas-microsoft-com:mac:vml" xmlns:o="urn:schemas-microsoft-com:office:office" xmlns:v="urn:schemas-microsoft-com:vml" xmlns:w10="urn:schemas-microsoft-com:office:word" xmlns:w="http://schemas.openxmlformats.org/wordprocessingml/2006/main" xmlns:ma14="http://schemas.microsoft.com/office/mac/drawingml/2011/main" xmlns:arto="http://schemas.microsoft.com/office/word/2006/arto"/>
                         </a:ext>
                       </a:extLst>
                     </wps:spPr>
@@ -4751,7 +4751,7 @@
             </wp:anchor>
           </w:drawing>
         </mc:Choice>
-        <mc:Fallback xmlns:w16sdtfl="http://schemas.microsoft.com/office/word/2024/wordml/sdtformatlock" xmlns:w16du="http://schemas.microsoft.com/office/word/2023/wordml/word16du" xmlns:oel="http://schemas.microsoft.com/office/2019/extlst">
+        <mc:Fallback xmlns:oel="http://schemas.microsoft.com/office/2019/extlst" xmlns:w16du="http://schemas.microsoft.com/office/word/2023/wordml/word16du" xmlns:w16sdtfl="http://schemas.microsoft.com/office/word/2024/wordml/sdtformatlock">
           <w:pict>
             <v:shape w14:anchorId="467F63D4" id="Cuadro de texto 17" o:spid="_x0000_s1029" type="#_x0000_t202" style="position:absolute;margin-left:-.5pt;margin-top:9.1pt;width:126pt;height:29pt;z-index:251645440;visibility:visible;mso-wrap-style:square;mso-width-percent:0;mso-height-percent:0;mso-wrap-distance-left:9pt;mso-wrap-distance-top:0;mso-wrap-distance-right:9pt;mso-wrap-distance-bottom:0;mso-position-horizontal:absolute;mso-position-horizontal-relative:text;mso-position-vertical:absolute;mso-position-vertical-relative:text;mso-width-percent:0;mso-height-percent:0;mso-width-relative:margin;mso-height-relative:margin;v-text-anchor:top" o:gfxdata="UEsDBBQABgAIAAAAIQC2gziS/gAAAOEBAAATAAAAW0NvbnRlbnRfVHlwZXNdLnhtbJSRQU7DMBBF 90jcwfIWJU67QAgl6YK0S0CoHGBkTxKLZGx5TGhvj5O2G0SRWNoz/78nu9wcxkFMGNg6quQqL6RA 0s5Y6ir5vt9lD1JwBDIwOMJKHpHlpr69KfdHjyxSmriSfYz+USnWPY7AufNIadK6MEJMx9ApD/oD OlTrorhX2lFEilmcO2RdNtjC5xDF9pCuTyYBB5bi6bQ4syoJ3g9WQ0ymaiLzg5KdCXlKLjvcW893 SUOqXwnz5DrgnHtJTxOsQfEKIT7DmDSUCaxw7Rqn8787ZsmRM9e2VmPeBN4uqYvTtW7jvijg9N/y JsXecLq0q+WD6m8AAAD//wMAUEsDBBQABgAIAAAAIQA4/SH/1gAAAJQBAAALAAAAX3JlbHMvLnJl bHOkkMFqwzAMhu+DvYPRfXGawxijTi+j0GvpHsDYimMaW0Yy2fr2M4PBMnrbUb/Q94l/f/hMi1qR JVI2sOt6UJgd+ZiDgffL8ekFlFSbvV0oo4EbChzGx4f9GRdb25HMsYhqlCwG5lrLq9biZkxWOiqY 22YiTra2kYMu1l1tQD30/bPm3wwYN0x18gb45AdQl1tp5j/sFB2T0FQ7R0nTNEV3j6o9feQzro1i OWA14Fm+Q8a1a8+Bvu/d/dMb2JY5uiPbhG/ktn4cqGU/er3pcvwCAAD//wMAUEsDBBQABgAIAAAA IQBDTwJKWQIAACsFAAAOAAAAZHJzL2Uyb0RvYy54bWysVE1v2zAMvQ/YfxB0X522QFAEcYqsRYYB RVusLXpWZKkxJosaxcTOfv0o2U66bpcOu8g0xcePR1Lzy65xYmcw1uBLeXoykcJ4DVXtX0r59Lj6 dCFFJOUr5cCbUu5NlJeLjx/mbZiZM9iAqwwKduLjrA2l3BCFWVFEvTGNiicQjOdLC9go4l98KSpU LXtvXHE2mUyLFrAKCNrEyNrr/lIusn9rjaY7a6Mh4UrJuVE+MZ/rdBaLuZq9oAqbWg9pqH/IolG1 56AHV9eKlNhi/YerptYIESydaGgKsLbWJtfA1ZxO3lTzsFHB5FqYnBgONMX/51bf7h7CPQrqPkPH DUyEtCHOIitTPZ3FJn05U8H3TOH+QJvpSOgEmk4m3AspNN+dTy/OWWY3xREdMNIXA41IQimR25LZ UrubSL3paJKCeVjVzuXWOP+bgn32GpN7O6CPCWeJ9s4klPPfjBV1lfNOijxV5sqh2CmeB6W18ZRL zn7ZOllZjv0e4GCfoH1W7wEfEDkyeDqAm9oDZpbepF19H1O2vT1T/aruJFK37rhw7sbYzzVUe24z Qr8BMehVzb24UZHuFfLIc/t4jemOD+ugLSUMkhQbwJ9/0yd7nkS+laLlFSpl/LFVaKRwXz3PaNq3 UcBRWI+C3zZXwF045Qci6CwyAMmNokVonnm7lykKXymvOVYpaRSvqF9kfh20WS6zEW9VUHTjH4JO rhOrabIeu2eFYRg/4sG9hXG51OzNFPa2CelhuSWwdR7RxGvP4sA3b2Qe8uH1SCv/+j9bHd+4xS8A AAD//wMAUEsDBBQABgAIAAAAIQCVKrro3QAAAAgBAAAPAAAAZHJzL2Rvd25yZXYueG1sTI/BTsMw EETvSPyDtUjcWqeRCCXEqSoEJyREGg4cnXibWI3XIXbb8PdsT/S4M6PZN8VmdoM44RSsJwWrZQIC qfXGUqfgq35brEGEqMnowRMq+MUAm/L2ptC58Weq8LSLneASCrlW0Mc45lKGtkenw9KPSOzt/eR0 5HPqpJn0mcvdINMkyaTTlvhDr0d86bE97I5Owfabqlf789F8VvvK1vVTQu/ZQan7u3n7DCLiHP/D cMFndCiZqfFHMkEMChYrnhJZX6cg2E8fLkKj4DFLQZaFvB5Q/gEAAP//AwBQSwECLQAUAAYACAAA ACEAtoM4kv4AAADhAQAAEwAAAAAAAAAAAAAAAAAAAAAAW0NvbnRlbnRfVHlwZXNdLnhtbFBLAQIt ABQABgAIAAAAIQA4/SH/1gAAAJQBAAALAAAAAAAAAAAAAAAAAC8BAABfcmVscy8ucmVsc1BLAQIt ABQABgAIAAAAIQBDTwJKWQIAACsFAAAOAAAAAAAAAAAAAAAAAC4CAABkcnMvZTJvRG9jLnhtbFBL AQItABQABgAIAAAAIQCVKrro3QAAAAgBAAAPAAAAAAAAAAAAAAAAALMEAABkcnMvZG93bnJldi54 bWxQSwUGAAAAAAQABADzAAAAvQUAAAAA " filled="f" stroked="f">
               <v:textbox inset="0,0,0,0">
@@ -4859,7 +4859,7 @@
             </wp:anchor>
           </w:drawing>
         </mc:Choice>
-        <mc:Fallback xmlns:w16sdtfl="http://schemas.microsoft.com/office/word/2024/wordml/sdtformatlock" xmlns:w16du="http://schemas.microsoft.com/office/word/2023/wordml/word16du" xmlns:oel="http://schemas.microsoft.com/office/2019/extlst">
+        <mc:Fallback xmlns:oel="http://schemas.microsoft.com/office/2019/extlst" xmlns:w16du="http://schemas.microsoft.com/office/word/2023/wordml/word16du" xmlns:w16sdtfl="http://schemas.microsoft.com/office/word/2024/wordml/sdtformatlock">
           <w:pict>
             <v:rect w14:anchorId="1111E503" id="Rectángulo 19" o:spid="_x0000_s1026" style="position:absolute;margin-left:561.15pt;margin-top:11.25pt;width:9pt;height:30.6pt;z-index:251648512;visibility:visible;mso-wrap-style:square;mso-width-percent:0;mso-height-percent:0;mso-wrap-distance-left:9pt;mso-wrap-distance-top:0;mso-wrap-distance-right:9pt;mso-wrap-distance-bottom:0;mso-position-horizontal:absolute;mso-position-horizontal-relative:text;mso-position-vertical:absolute;mso-position-vertical-relative:text;mso-width-percent:0;mso-height-percent:0;mso-width-relative:margin;mso-height-relative:margin;v-text-anchor:middle" o:gfxdata="UEsDBBQABgAIAAAAIQC2gziS/gAAAOEBAAATAAAAW0NvbnRlbnRfVHlwZXNdLnhtbJSRQU7DMBBF 90jcwfIWJU67QAgl6YK0S0CoHGBkTxKLZGx5TGhvj5O2G0SRWNoz/78nu9wcxkFMGNg6quQqL6RA 0s5Y6ir5vt9lD1JwBDIwOMJKHpHlpr69KfdHjyxSmriSfYz+USnWPY7AufNIadK6MEJMx9ApD/oD OlTrorhX2lFEilmcO2RdNtjC5xDF9pCuTyYBB5bi6bQ4syoJ3g9WQ0ymaiLzg5KdCXlKLjvcW893 SUOqXwnz5DrgnHtJTxOsQfEKIT7DmDSUCaxw7Rqn8787ZsmRM9e2VmPeBN4uqYvTtW7jvijg9N/y JsXecLq0q+WD6m8AAAD//wMAUEsDBBQABgAIAAAAIQA4/SH/1gAAAJQBAAALAAAAX3JlbHMvLnJl bHOkkMFqwzAMhu+DvYPRfXGawxijTi+j0GvpHsDYimMaW0Yy2fr2M4PBMnrbUb/Q94l/f/hMi1qR JVI2sOt6UJgd+ZiDgffL8ekFlFSbvV0oo4EbChzGx4f9GRdb25HMsYhqlCwG5lrLq9biZkxWOiqY 22YiTra2kYMu1l1tQD30/bPm3wwYN0x18gb45AdQl1tp5j/sFB2T0FQ7R0nTNEV3j6o9feQzro1i OWA14Fm+Q8a1a8+Bvu/d/dMb2JY5uiPbhG/ktn4cqGU/er3pcvwCAAD//wMAUEsDBBQABgAIAAAA IQBWADS9ZwIAAEkFAAAOAAAAZHJzL2Uyb0RvYy54bWysVN9r2zAQfh/sfxB6Xx2nWdeFOiW0ZAxK V9aOPiuylAhknXZS4mR//U6y42RdoTCWB+Xk+777fbq63jWWbRUGA67i5dmIM+Uk1MatKv7jafHh krMQhauFBacqvleBX8/ev7tq/VSNYQ22VsjIiAvT1ld8HaOfFkWQa9WIcAZeOVJqwEZEuuKqqFG0 ZL2xxXg0uihawNojSBUCfb3tlHyW7WutZPymdVCR2YpTbDGfmM9lOovZlZiuUPi1kX0Y4h+iaIRx 5HQwdSuiYBs0f5lqjEQIoOOZhKYArY1UOQfKphy9yOZxLbzKuVBxgh/KFP6fWXm/ffQPSGVofZgG ElMWO41N+qf42C4Xaz8US+0ik/SxLCfnIyqpJNX55eXFOBezOJI9hvhFQcOSUHGkXuQSie1diOSQ oAdI8hXAmnphrM0XXC1vLLKtoL4tFiP6pVYR5Q+YdQnsINE6dfdF5c73bo6JZSnurUos674rzUyd Uslx5ZlTg1chpXKx7N1mdKJpcjUQz98m9vhE7aIayOO3yQMjewYXB3JjHOBrBuwQsu7wVLWTvJO4 hHr/gAyh24bg5cJQi+5EiA8Cafypq7TS8Rsd2kJbceglztaAv177nvA0laTlrKV1qnj4uRGoOLNf Hc3r53IySfuXL5OPn2haGJ5qlqcat2lugDpf0uPhZRYTPtqDqBGaZ9r8efJKKuEk+a64jHi43MRu zentkGo+zzDaOS/inXv08tD1NIJPu2eBvp/TSAN+D4fVE9MX49phUz8czDcRtMmzfKxrX2/a1zyv /duSHoTTe0YdX8DZbwAAAP//AwBQSwMEFAAGAAgAAAAhAKIXaD3fAAAACwEAAA8AAABkcnMvZG93 bnJldi54bWxMj8tOwzAQRfdI/IM1SGwQtePyqEKcCqVErGkREjs3HpLQ2I5iNzV/z3QFyztzdB/F OtmBzTiF3jsF2UIAQ9d407tWwfuuvl0BC1E7owfvUMEPBliXlxeFzo0/uTect7FlZOJCrhV0MY45 56Hp0Oqw8CM6+n35yepIcmq5mfSJzO3ApRAP3OreUUKnR6w6bA7bo6WQ5D9e5lTtvj+rw81rKzZN XW+Uur5Kz0/AIqb4B8O5PlWHkjrt/dGZwAbSmZRLYhVIeQ/sTGR3gi57BavlI/Cy4P83lL8AAAD/ /wMAUEsBAi0AFAAGAAgAAAAhALaDOJL+AAAA4QEAABMAAAAAAAAAAAAAAAAAAAAAAFtDb250ZW50 X1R5cGVzXS54bWxQSwECLQAUAAYACAAAACEAOP0h/9YAAACUAQAACwAAAAAAAAAAAAAAAAAvAQAA X3JlbHMvLnJlbHNQSwECLQAUAAYACAAAACEAVgA0vWcCAABJBQAADgAAAAAAAAAAAAAAAAAuAgAA ZHJzL2Uyb0RvYy54bWxQSwECLQAUAAYACAAAACEAohdoPd8AAAALAQAADwAAAAAAAAAAAAAAAADB BAAAZHJzL2Rvd25yZXYueG1sUEsFBgAAAAAEAAQA8wAAAM0FAAAAAA== " fillcolor="red" stroked="f"/>
           </w:pict>
@@ -5089,7 +5089,7 @@
                       <a:effectLst/>
                       <a:extLst>
                         <a:ext uri="{C572A759-6A51-4108-AA02-DFA0A04FC94B}">
-                          <ma14:wrappingTextBoxFlag xmlns:arto="http://schemas.microsoft.com/office/word/2006/arto" xmlns:ma14="http://schemas.microsoft.com/office/mac/drawingml/2011/main" xmlns:w="http://schemas.openxmlformats.org/wordprocessingml/2006/main" xmlns:w10="urn:schemas-microsoft-com:office:word" xmlns:v="urn:schemas-microsoft-com:vml" xmlns:o="urn:schemas-microsoft-com:office:office" xmlns:mv="urn:schemas-microsoft-com:mac:vml" xmlns:mo="http://schemas.microsoft.com/office/mac/office/2008/main" xmlns="" xmlns:w16sdtfl="http://schemas.microsoft.com/office/word/2024/wordml/sdtformatlock" xmlns:w16du="http://schemas.microsoft.com/office/word/2023/wordml/word16du" xmlns:oel="http://schemas.microsoft.com/office/2019/extlst"/>
+                          <ma14:wrappingTextBoxFlag xmlns:oel="http://schemas.microsoft.com/office/2019/extlst" xmlns:w16du="http://schemas.microsoft.com/office/word/2023/wordml/word16du" xmlns:w16sdtfl="http://schemas.microsoft.com/office/word/2024/wordml/sdtformatlock" xmlns="" xmlns:mo="http://schemas.microsoft.com/office/mac/office/2008/main" xmlns:mv="urn:schemas-microsoft-com:mac:vml" xmlns:o="urn:schemas-microsoft-com:office:office" xmlns:v="urn:schemas-microsoft-com:vml" xmlns:w10="urn:schemas-microsoft-com:office:word" xmlns:w="http://schemas.openxmlformats.org/wordprocessingml/2006/main" xmlns:ma14="http://schemas.microsoft.com/office/mac/drawingml/2011/main" xmlns:arto="http://schemas.microsoft.com/office/word/2006/arto"/>
                         </a:ext>
                       </a:extLst>
                     </wps:spPr>
@@ -5139,7 +5139,7 @@
             </wp:anchor>
           </w:drawing>
         </mc:Choice>
-        <mc:Fallback xmlns:w16sdtfl="http://schemas.microsoft.com/office/word/2024/wordml/sdtformatlock" xmlns:w16du="http://schemas.microsoft.com/office/word/2023/wordml/word16du" xmlns:oel="http://schemas.microsoft.com/office/2019/extlst">
+        <mc:Fallback xmlns:oel="http://schemas.microsoft.com/office/2019/extlst" xmlns:w16du="http://schemas.microsoft.com/office/word/2023/wordml/word16du" xmlns:w16sdtfl="http://schemas.microsoft.com/office/word/2024/wordml/sdtformatlock">
           <w:pict>
             <v:shapetype w14:anchorId="109557F1" id="_x0000_t202" coordsize="21600,21600" o:spt="202" path="m,l,21600r21600,l21600,xe">
               <v:stroke joinstyle="miter"/>
@@ -5205,7 +5205,7 @@
                       <a:effectLst/>
                       <a:extLst>
                         <a:ext uri="{C572A759-6A51-4108-AA02-DFA0A04FC94B}">
-                          <ma14:wrappingTextBoxFlag xmlns:arto="http://schemas.microsoft.com/office/word/2006/arto" xmlns:ma14="http://schemas.microsoft.com/office/mac/drawingml/2011/main" xmlns:w="http://schemas.openxmlformats.org/wordprocessingml/2006/main" xmlns:w10="urn:schemas-microsoft-com:office:word" xmlns:v="urn:schemas-microsoft-com:vml" xmlns:o="urn:schemas-microsoft-com:office:office" xmlns:mv="urn:schemas-microsoft-com:mac:vml" xmlns:mo="http://schemas.microsoft.com/office/mac/office/2008/main" xmlns="" xmlns:w16sdtfl="http://schemas.microsoft.com/office/word/2024/wordml/sdtformatlock" xmlns:w16du="http://schemas.microsoft.com/office/word/2023/wordml/word16du" xmlns:oel="http://schemas.microsoft.com/office/2019/extlst"/>
+                          <ma14:wrappingTextBoxFlag xmlns:oel="http://schemas.microsoft.com/office/2019/extlst" xmlns:w16du="http://schemas.microsoft.com/office/word/2023/wordml/word16du" xmlns:w16sdtfl="http://schemas.microsoft.com/office/word/2024/wordml/sdtformatlock" xmlns="" xmlns:mo="http://schemas.microsoft.com/office/mac/office/2008/main" xmlns:mv="urn:schemas-microsoft-com:mac:vml" xmlns:o="urn:schemas-microsoft-com:office:office" xmlns:v="urn:schemas-microsoft-com:vml" xmlns:w10="urn:schemas-microsoft-com:office:word" xmlns:w="http://schemas.openxmlformats.org/wordprocessingml/2006/main" xmlns:ma14="http://schemas.microsoft.com/office/mac/drawingml/2011/main" xmlns:arto="http://schemas.microsoft.com/office/word/2006/arto"/>
                         </a:ext>
                       </a:extLst>
                     </wps:spPr>
@@ -5301,7 +5301,7 @@
             </wp:anchor>
           </w:drawing>
         </mc:Choice>
-        <mc:Fallback xmlns:w16sdtfl="http://schemas.microsoft.com/office/word/2024/wordml/sdtformatlock" xmlns:w16du="http://schemas.microsoft.com/office/word/2023/wordml/word16du" xmlns:oel="http://schemas.microsoft.com/office/2019/extlst">
+        <mc:Fallback xmlns:oel="http://schemas.microsoft.com/office/2019/extlst" xmlns:w16du="http://schemas.microsoft.com/office/word/2023/wordml/word16du" xmlns:w16sdtfl="http://schemas.microsoft.com/office/word/2024/wordml/sdtformatlock">
           <w:pict>
             <v:shape w14:anchorId="15919627" id="Cuadro de texto 23" o:spid="_x0000_s1027" type="#_x0000_t202" style="position:absolute;margin-left:18.1pt;margin-top:11.95pt;width:63.35pt;height:27.15pt;z-index:251666432;visibility:visible;mso-wrap-style:square;mso-width-percent:0;mso-height-percent:0;mso-wrap-distance-left:9pt;mso-wrap-distance-top:0;mso-wrap-distance-right:9pt;mso-wrap-distance-bottom:0;mso-position-horizontal:absolute;mso-position-horizontal-relative:text;mso-position-vertical:absolute;mso-position-vertical-relative:text;mso-width-percent:0;mso-height-percent:0;mso-width-relative:margin;mso-height-relative:margin;v-text-anchor:top" o:gfxdata="UEsDBBQABgAIAAAAIQC2gziS/gAAAOEBAAATAAAAW0NvbnRlbnRfVHlwZXNdLnhtbJSRQU7DMBBF 90jcwfIWJU67QAgl6YK0S0CoHGBkTxKLZGx5TGhvj5O2G0SRWNoz/78nu9wcxkFMGNg6quQqL6RA 0s5Y6ir5vt9lD1JwBDIwOMJKHpHlpr69KfdHjyxSmriSfYz+USnWPY7AufNIadK6MEJMx9ApD/oD OlTrorhX2lFEilmcO2RdNtjC5xDF9pCuTyYBB5bi6bQ4syoJ3g9WQ0ymaiLzg5KdCXlKLjvcW893 SUOqXwnz5DrgnHtJTxOsQfEKIT7DmDSUCaxw7Rqn8787ZsmRM9e2VmPeBN4uqYvTtW7jvijg9N/y JsXecLq0q+WD6m8AAAD//wMAUEsDBBQABgAIAAAAIQA4/SH/1gAAAJQBAAALAAAAX3JlbHMvLnJl bHOkkMFqwzAMhu+DvYPRfXGawxijTi+j0GvpHsDYimMaW0Yy2fr2M4PBMnrbUb/Q94l/f/hMi1qR JVI2sOt6UJgd+ZiDgffL8ekFlFSbvV0oo4EbChzGx4f9GRdb25HMsYhqlCwG5lrLq9biZkxWOiqY 22YiTra2kYMu1l1tQD30/bPm3wwYN0x18gb45AdQl1tp5j/sFB2T0FQ7R0nTNEV3j6o9feQzro1i OWA14Fm+Q8a1a8+Bvu/d/dMb2JY5uiPbhG/ktn4cqGU/er3pcvwCAAD//wMAUEsDBBQABgAIAAAA IQBgiwrkYAIAADMFAAAOAAAAZHJzL2Uyb0RvYy54bWysVE1v2zAMvQ/YfxB0X+20SVEEcYqsRYcB RVssHXpWZCkxJosapcTOfv0o2U6CbJcOu8i0+Pj1SGp229aG7RT6CmzBRxc5Z8pKKCu7Lvj314dP N5z5IGwpDFhV8L3y/Hb+8cOscVN1CRswpUJGTqyfNq7gmxDcNMu83Kha+AtwypJSA9Yi0C+usxJF Q95rk13m+XXWAJYOQSrv6fa+U/J58q+1kuFZa68CMwWn3EI6MZ2reGbzmZiuUbhNJfs0xD9kUYvK UtCDq3sRBNti9YerupIIHnS4kFBnoHUlVaqBqhnlZ9UsN8KpVAuR492BJv//3Mqn3dK9IAvtZ2ip gZGQxvmpp8tYT6uxjl/KlJGeKNwfaFNtYJIub/LxZDzhTJLqajy+ySfRS3Y0dujDFwU1i0LBkbqS yBK7Rx866ACJsSw8VMakzhjLmoJfX03yZHDQkHNjI1alHvdujoknKeyNihhjvynNqjLlHy/SdKk7 g2wnaC6ElMqGVHryS+iI0pTEewx7/DGr9xh3dQyRwYaDcV1ZwFT9WdrljyFl3eGJ85O6oxjaVUuF n/R1BeWe2o3QbYJ38qGipjwKH14E0uhTh2mdwzMd2gCRD73E2Qbw19/uI54mkrScNbRKBfc/twIV Z+arpVmNezcIOAirQbDb+g6oCyN6KJxMIhlgMIOoEeo32vJFjEIqYSXFKngYxLvQLTS9ElItFglE 2+VEeLRLJ6Pr2JQ4Yq/tm0DXz2GgAX6CYcnE9GwcO2y0tLDYBtBVmtXIa8dizzdtZpr2/hWJq3/6 n1DHt27+GwAA//8DAFBLAwQUAAYACAAAACEAxN+zVt4AAAAIAQAADwAAAGRycy9kb3ducmV2Lnht bEyPS0/DMBCE70j8B2uRuFGnrhRKiFMhHjeebZHg5sRLEmGvI9tJw7/HPcFtVjOa+bbczNawCX3o HUlYLjJgSI3TPbUS9ruHizWwEBVpZRyhhB8MsKlOT0pVaHegN5y2sWWphEKhJHQxDgXnoenQqrBw A1Lyvpy3KqbTt1x7dUjl1nCRZTm3qqe00KkBbztsvrejlWA+gn+ss/g53bVP8fWFj+/3y2cpz8/m m2tgEef4F4YjfkKHKjHVbiQdmJGwykVKShCrK2BHPxdJ1BIu1wJ4VfL/D1S/AAAA//8DAFBLAQIt ABQABgAIAAAAIQC2gziS/gAAAOEBAAATAAAAAAAAAAAAAAAAAAAAAABbQ29udGVudF9UeXBlc10u eG1sUEsBAi0AFAAGAAgAAAAhADj9If/WAAAAlAEAAAsAAAAAAAAAAAAAAAAALwEAAF9yZWxzLy5y ZWxzUEsBAi0AFAAGAAgAAAAhAGCLCuRgAgAAMwUAAA4AAAAAAAAAAAAAAAAALgIAAGRycy9lMm9E b2MueG1sUEsBAi0AFAAGAAgAAAAhAMTfs1beAAAACAEAAA8AAAAAAAAAAAAAAAAAugQAAGRycy9k b3ducmV2LnhtbFBLBQYAAAAABAAEAPMAAADFBQAAAAA= " filled="f" stroked="f" strokeweight=".5pt">
               <v:textbox inset="0,0,0,0">
@@ -5442,7 +5442,7 @@
             </wp:anchor>
           </w:drawing>
         </mc:Choice>
-        <mc:Fallback xmlns:w16sdtfl="http://schemas.microsoft.com/office/word/2024/wordml/sdtformatlock" xmlns:w16du="http://schemas.microsoft.com/office/word/2023/wordml/word16du" xmlns:oel="http://schemas.microsoft.com/office/2019/extlst">
+        <mc:Fallback xmlns:oel="http://schemas.microsoft.com/office/2019/extlst" xmlns:w16du="http://schemas.microsoft.com/office/word/2023/wordml/word16du" xmlns:w16sdtfl="http://schemas.microsoft.com/office/word/2024/wordml/sdtformatlock">
           <w:pict>
             <v:rect w14:anchorId="752BA5BD" id="Rectángulo 22" o:spid="_x0000_s1026" style="position:absolute;margin-left:0;margin-top:-15.2pt;width:8.5pt;height:50.9pt;z-index:251665408;visibility:visible;mso-wrap-style:square;mso-width-percent:0;mso-height-percent:0;mso-wrap-distance-left:9pt;mso-wrap-distance-top:0;mso-wrap-distance-right:9pt;mso-wrap-distance-bottom:0;mso-position-horizontal:absolute;mso-position-horizontal-relative:text;mso-position-vertical:absolute;mso-position-vertical-relative:text;mso-width-percent:0;mso-height-percent:0;mso-width-relative:margin;mso-height-relative:margin;v-text-anchor:middle" o:gfxdata="UEsDBBQABgAIAAAAIQC2gziS/gAAAOEBAAATAAAAW0NvbnRlbnRfVHlwZXNdLnhtbJSRQU7DMBBF 90jcwfIWJU67QAgl6YK0S0CoHGBkTxKLZGx5TGhvj5O2G0SRWNoz/78nu9wcxkFMGNg6quQqL6RA 0s5Y6ir5vt9lD1JwBDIwOMJKHpHlpr69KfdHjyxSmriSfYz+USnWPY7AufNIadK6MEJMx9ApD/oD OlTrorhX2lFEilmcO2RdNtjC5xDF9pCuTyYBB5bi6bQ4syoJ3g9WQ0ymaiLzg5KdCXlKLjvcW893 SUOqXwnz5DrgnHtJTxOsQfEKIT7DmDSUCaxw7Rqn8787ZsmRM9e2VmPeBN4uqYvTtW7jvijg9N/y JsXecLq0q+WD6m8AAAD//wMAUEsDBBQABgAIAAAAIQA4/SH/1gAAAJQBAAALAAAAX3JlbHMvLnJl bHOkkMFqwzAMhu+DvYPRfXGawxijTi+j0GvpHsDYimMaW0Yy2fr2M4PBMnrbUb/Q94l/f/hMi1qR JVI2sOt6UJgd+ZiDgffL8ekFlFSbvV0oo4EbChzGx4f9GRdb25HMsYhqlCwG5lrLq9biZkxWOiqY 22YiTra2kYMu1l1tQD30/bPm3wwYN0x18gb45AdQl1tp5j/sFB2T0FQ7R0nTNEV3j6o9feQzro1i OWA14Fm+Q8a1a8+Bvu/d/dMb2JY5uiPbhG/ktn4cqGU/er3pcvwCAAD//wMAUEsDBBQABgAIAAAA IQDIk3vWZQIAAEkFAAAOAAAAZHJzL2Uyb0RvYy54bWysVF9v2jAQf5+072D5fSRQ2nWooUJUTJOq Fq2d+mwcGyI5Pu9sCOzT7+yEwLpKlaa92He+3/2/883tvjZsp9BXYAs+HOScKSuhrOy64D+eF5+u OfNB2FIYsKrgB+X57fTjh5vGTdQINmBKhYyMWD9pXME3IbhJlnm5UbXwA3DKklAD1iIQi+usRNGQ 9dpkozy/yhrA0iFI5T293rVCPk32tVYyPGrtVWCm4BRbSCemcxXPbHojJmsUblPJLgzxD1HUorLk tDd1J4JgW6z+MlVXEsGDDgMJdQZaV1KlHCibYf4qm6eNcCrlQsXxri+T/39m5cPuyS2RytA4P/FE xiz2Gut4U3xsn4p16Iul9oFJehzm13lOJZUkuhpfjS4uYzGzk7JDH74qqFkkCo7Ui1Qisbv3oYUe IdGXB1OVi8qYxOB6NTfIdoL6tliQo9Qqsv4HzNgIthDVWovti0qd79ycEktUOBgVtYz9rjSryphK iivNnOq9CimVDcMuqYSOappc9YoX7yt2+KjaRtUrj95X7jWSZ7ChV64rC/iWAdOHrFs89eQs70iu oDwskSG02+CdXFTUonvhw1IgjT91lVY6PNKhDTQFh47ibAP46633iKepJClnDa1Twf3PrUDFmflm aV6/DMfjuH+JGV9+HhGD55LVucRu6zlQ54f0eTiZyIgP5khqhPqFNn8WvZJIWEm+Cy4DHpl5aNec /g6pZrMEo51zItzbJyePXY8j+Lx/Eei6OQ004A9wXD0xeTWuLTb2w8JsG0BXaZZPde3qTfuatqH7 W+KHcM4n1OkHnP4GAAD//wMAUEsDBBQABgAIAAAAIQBJviZV3AAAAAYBAAAPAAAAZHJzL2Rvd25y ZXYueG1sTI/BTsMwEETvSPyDtUhcUGsXKopCnAqlRJxpERI3N16S0HgdxW5q/p7tiR5nZzXzJl8n 14sJx9B50rCYKxBItbcdNRo+dtXsCUSIhqzpPaGGXwywLq6vcpNZf6J3nLaxERxCITMa2hiHTMpQ t+hMmPsBib1vPzoTWY6NtKM5cbjr5b1Sj9KZjrihNQOWLdaH7dFxSfKfr1Mqdz9f5eHurVGbuqo2 Wt/epJdnEBFT/H+GMz6jQ8FMe38kG0SvgYdEDbMHtQRxtld82GtYLZYgi1xe4hd/AAAA//8DAFBL AQItABQABgAIAAAAIQC2gziS/gAAAOEBAAATAAAAAAAAAAAAAAAAAAAAAABbQ29udGVudF9UeXBl c10ueG1sUEsBAi0AFAAGAAgAAAAhADj9If/WAAAAlAEAAAsAAAAAAAAAAAAAAAAALwEAAF9yZWxz Ly5yZWxzUEsBAi0AFAAGAAgAAAAhAMiTe9ZlAgAASQUAAA4AAAAAAAAAAAAAAAAALgIAAGRycy9l Mm9Eb2MueG1sUEsBAi0AFAAGAAgAAAAhAEm+JlXcAAAABgEAAA8AAAAAAAAAAAAAAAAAvwQAAGRy cy9kb3ducmV2LnhtbFBLBQYAAAAABAAEAPMAAADIBQAAAAA= " fillcolor="red" stroked="f"/>
           </w:pict>
@@ -5466,21 +5466,7 @@
         <w:rFonts w:ascii="Open Sans" w:hAnsi="Open Sans" w:cs="Open Sans"/>
         <w:sz w:val="16"/>
       </w:rPr>
-      <w:t>PR.DEP.2025</w:t>
-    </w:r>
-    <w:r>
-      <w:rPr>
-        <w:rFonts w:ascii="Open Sans" w:hAnsi="Open Sans" w:cs="Open Sans"/>
-        <w:sz w:val="16"/>
-      </w:rPr>
-      <w:t>.0</w:t>
-    </w:r>
-    <w:r>
-      <w:rPr>
-        <w:rFonts w:ascii="Open Sans" w:hAnsi="Open Sans" w:cs="Open Sans"/>
-        <w:sz w:val="16"/>
-      </w:rPr>
-      <w:t>215</w:t>
+      <w:t>{{PR_CODE}}</w:t>
     </w:r>
     <w:r>
       <w:rPr>
@@ -5494,7 +5480,7 @@
         <w:rFonts w:ascii="Open Sans" w:hAnsi="Open Sans" w:cs="Open Sans"/>
         <w:sz w:val="16"/>
       </w:rPr>
-      <w:t>2</w:t>
+      <w:t>{{REVISION}}</w:t>
     </w:r>
   </w:p>
   <w:p>
@@ -10090,7 +10076,7 @@
     <w:charset w:val="00"/>
     <w:family w:val="swiss"/>
     <w:pitch w:val="variable"/>
-    <w:sig w:usb0="E4002EFF" w:usb1="C000247B" w:usb2="00000009" w:usb3="00000000" w:csb0="000001FF" w:csb1="00000000"/>
+    <w:sig w:usb0="E4002EFF" w:usb1="C200247B" w:usb2="00000009" w:usb3="00000000" w:csb0="000001FF" w:csb1="00000000"/>
   </w:font>
   <w:font w:name="Cambria">
     <w:panose1 w:val="02040503050406030204"/>
@@ -10147,7 +10133,7 @@
     <w:charset w:val="00"/>
     <w:family w:val="swiss"/>
     <w:pitch w:val="variable"/>
-    <w:sig w:usb0="E4002EFF" w:usb1="C000247B" w:usb2="00000009" w:usb3="00000000" w:csb0="000001FF" w:csb1="00000000"/>
+    <w:sig w:usb0="E4002EFF" w:usb1="C200247B" w:usb2="00000009" w:usb3="00000000" w:csb0="000001FF" w:csb1="00000000"/>
   </w:font>
 </w:fonts>
 </file>
@@ -10227,6 +10213,7 @@
     <w:rsid w:val="00816B6C"/>
     <w:rsid w:val="00830CD2"/>
     <w:rsid w:val="0083568B"/>
+    <w:rsid w:val="00854462"/>
     <w:rsid w:val="008831E3"/>
     <w:rsid w:val="008B0DAC"/>
     <w:rsid w:val="008B2855"/>
@@ -11059,7 +11046,7 @@
         <a:effectLst/>
         <a:extLst>
           <a:ext uri="{C572A759-6A51-4108-AA02-DFA0A04FC94B}">
-            <ma14:wrappingTextBoxFlag xmlns="" xmlns:ma14="http://schemas.microsoft.com/office/mac/drawingml/2011/main"/>
+            <ma14:wrappingTextBoxFlag xmlns:ma14="http://schemas.microsoft.com/office/mac/drawingml/2011/main" xmlns=""/>
           </a:ext>
         </a:extLst>
       </a:spPr>

</xml_diff>